<commit_message>
feat(design): adopt the CEO demo's design system app-wide
Shared tokens.css (demo colours exactly, derived dark mode), components.css
and components.js (window.FM: toast, multi-step modal, stepper, ticker,
SVG icon set replacing emoji, session/API helpers, sign-in card, top bar).
Adds a live gallery at /design-system, docs/design-system.md, a responsive
overflow checker (390/820/1400px), CHANGELOG, and Style Guide section 10.

Co-Authored-By: Claude Opus 5.5 <noreply@anthropic.com>
</commit_message>
<xml_diff>
--- a/Farm_Master_Style_Guide_Stage4.docx
+++ b/Farm_Master_Style_Guide_Stage4.docx
@@ -2340,6 +2340,702 @@
         <w:t>None blocking. Stage 6 (Build) now covers twenty-three real, tested flows in Stage 6 Build/, spanning every screen in the confirmed IA/wireframe/visual scope except the payment/OTP gateway integration itself. This pass (8 Sep 2026) closed 24 items in one push, following this session's own completeness audit finding the unbuilt-screen list was longer than previously tracked: the six already-known gaps (Reporting dashboard, MoFA import, Registration Approval Queue as its own screen, Field Visit Logs, Proof of Pickup/Delivery, Trunking) plus eighteen more screens never previously enumerated -- the four portal dashboards (Buyer, Farmer, Vendor, Control Centre), Farmer Wallet &amp; Settlement/Milestone Log/Agronomist Messaging, Vendor Subscription &amp; Billing/Payout Statement/Logistics Handoff Status, Buyer Documents/Tracking/Invoice, and the Audit Log's first real browsing screen -- plus the entire USSD/SMS channel (a session-based menu emulator with a real inactivity timeout, driven by real backend state, SIMULATED delivery with an assertable log), which had zero Stage 4 visual and zero build of any kind before this pass. Every PRD Section 6 Must-Have remains genuinely built, including Must-Have #3's literal scope. RBAC (7 roles), audit logging, and Finance/Super Admin segregation are foundational and now cover every new screen: Finance never sees account-admin data, Super Admin never sees reconciliation figures, and a vendor cannot approve its own date-conflict override. Real-time OTP verification via phone and email remains SIMULATED pending a chosen SMS/email provider -- confirmed 8 Sep 2026 as a deliberate, unchanged decision, not an oversight. A full responsive QA pass (SDD Sections 17-27) confirmed every flow renders correctly at desktop/tablet/phone with no horizontal page overflow and no interactive element under the 44px touch-target minimum (Section 5 above) -- across six extensions it found and fixed a systemic missing-viewport-meta-tag bug, several sub-44px controls, a non-collapsing two-column layout, two JS syntax bugs caught before testing, stale UI copy, a real navigation dead-end, and (this pass) a session-timer bug where the USSD emulator's inactivity countdown restarted itself even after showing SESSION EXPIRED, found and fixed during real browser click-through testing, not just flagged. See Farm_Master_SDD_Stage6.docx and Farm_Master_API_Documentation_Stage6.docx. Remaining, and now the only item on this list: any real mobile money/OTP/SMS gateway integration (PRD Section 1.1/12). The trading margin rate used by Finance &amp; Reconciliation is BUSINESS-UNCONFIRMED, same treatment as the other provisional rates -- see SDD Section 18. Stage 7 (Testing, 9 Sep 2026) automated the manual responsive/touch-target checks described above into a repeatable Playwright suite run at 375/768/1280px, and in doing so found one more sub-44px violation this list's prior passes had missed: the USSD phone emulator's own input field and Send button, at 37px in its bespoke phone-frame layout (not the shared .grid chrome the other checks cover) -- fixed by adding min-height:44px (and min-width on the button) in ussd_sms_flow_live.html. All 24 Stage 6 screens are now additionally verified by 575 automated tests (88% coverage on the backend); see Stage 6 Build/TEST_PLAN.md and SDD Section 28. RBAC was widened 9 September 2026 from 7 to 9 roles, splitting Pilot Operations Coordinator and Compliance/Reporting Officer out from Agronomist and Finance for real pilot-staff onboarding into the Control Centre -- see SDD Section 29; the same segregation-of-duties principle applies to both new roles (neither gets account/role administration or money-movement authority). Separately, 9 September 2026: the manual desktop/tablet/phone preview toggle used across every Stage 6 flow page (Section 5) was removed and replaced with real, automatic responsive design -- the same @container breakpoints (767px/1023px) that were already correct, now driven by the page's actual rendered width instead of a JS-set simulated frame, plus a real hamburger-triggered off-canvas drawer for the rail sidebar below 768px (previously the rail only flattened to a horizontal strip at a one-off 860px breakpoint, not this codebase's own 768/1024 convention). Verified live at 375/768/1280px across all 23 flow pages -- see SDD Section 30.</w:t>
       </w:r>
     </w:p>
+    <w:p>
+      <w:pPr>
+        <w:pStyle w:val="Heading1"/>
+      </w:pPr>
+      <w:r>
+        <w:t>10. October 2026 Revision: Adopting the CEO Platform Demo's Visual Language</w:t>
+      </w:r>
+    </w:p>
+    <w:p>
+      <w:r>
+        <w:t>On 11 October 2026 the CEO-approved clickable demo (docs/reference/Farm_Master_Platform_Demo.html) became the target for look, feel and core flows. This section supersedes Sections 3 (Color Palette) and 4 (Typography) above. Spacing, breakpoints and the lightweight-vs-dense component rules in Sections 5 and 7 still apply. The full, maintained reference is docs/design-system.md, and a live gallery is served at /design-system.</w:t>
+      </w:r>
+    </w:p>
+    <w:p>
+      <w:pPr>
+        <w:pStyle w:val="Heading2"/>
+      </w:pPr>
+      <w:r>
+        <w:t>10.1 Colour tokens (light values exactly as the demo)</w:t>
+      </w:r>
+    </w:p>
+    <w:tbl>
+      <w:tblPr>
+        <w:tblStyle w:val="TableGrid"/>
+        <w:tblW w:type="auto" w:w="0"/>
+        <w:tblLook w:firstColumn="1" w:firstRow="1" w:lastColumn="0" w:lastRow="0" w:noHBand="0" w:noVBand="1" w:val="04A0"/>
+      </w:tblPr>
+      <w:tblGrid>
+        <w:gridCol w:w="2880"/>
+        <w:gridCol w:w="2880"/>
+        <w:gridCol w:w="2880"/>
+      </w:tblGrid>
+      <w:tr>
+        <w:tc>
+          <w:tcPr>
+            <w:tcW w:type="dxa" w:w="2880"/>
+          </w:tcPr>
+          <w:p>
+            <w:r/>
+            <w:r>
+              <w:rPr>
+                <w:b/>
+                <w:sz w:val="18"/>
+              </w:rPr>
+              <w:t>Token</w:t>
+            </w:r>
+          </w:p>
+        </w:tc>
+        <w:tc>
+          <w:tcPr>
+            <w:tcW w:type="dxa" w:w="2880"/>
+          </w:tcPr>
+          <w:p>
+            <w:r/>
+            <w:r>
+              <w:rPr>
+                <w:b/>
+                <w:sz w:val="18"/>
+              </w:rPr>
+              <w:t>Hex</w:t>
+            </w:r>
+          </w:p>
+        </w:tc>
+        <w:tc>
+          <w:tcPr>
+            <w:tcW w:type="dxa" w:w="2880"/>
+          </w:tcPr>
+          <w:p>
+            <w:r/>
+            <w:r>
+              <w:rPr>
+                <w:b/>
+                <w:sz w:val="18"/>
+              </w:rPr>
+              <w:t>Use</w:t>
+            </w:r>
+          </w:p>
+        </w:tc>
+      </w:tr>
+      <w:tr>
+        <w:tc>
+          <w:tcPr>
+            <w:tcW w:type="dxa" w:w="2880"/>
+          </w:tcPr>
+          <w:p>
+            <w:r/>
+            <w:r>
+              <w:rPr>
+                <w:sz w:val="18"/>
+              </w:rPr>
+              <w:t>--forest-deep</w:t>
+            </w:r>
+          </w:p>
+        </w:tc>
+        <w:tc>
+          <w:tcPr>
+            <w:tcW w:type="dxa" w:w="2880"/>
+          </w:tcPr>
+          <w:p>
+            <w:r/>
+            <w:r>
+              <w:rPr>
+                <w:sz w:val="18"/>
+              </w:rPr>
+              <w:t>#173821</w:t>
+            </w:r>
+          </w:p>
+        </w:tc>
+        <w:tc>
+          <w:tcPr>
+            <w:tcW w:type="dxa" w:w="2880"/>
+          </w:tcPr>
+          <w:p>
+            <w:r/>
+            <w:r>
+              <w:rPr>
+                <w:sz w:val="18"/>
+              </w:rPr>
+              <w:t>Primary brand, headings, primary buttons, Farmer role</w:t>
+            </w:r>
+          </w:p>
+        </w:tc>
+      </w:tr>
+      <w:tr>
+        <w:tc>
+          <w:tcPr>
+            <w:tcW w:type="dxa" w:w="2880"/>
+          </w:tcPr>
+          <w:p>
+            <w:r/>
+            <w:r>
+              <w:rPr>
+                <w:sz w:val="18"/>
+              </w:rPr>
+              <w:t>--forest</w:t>
+            </w:r>
+          </w:p>
+        </w:tc>
+        <w:tc>
+          <w:tcPr>
+            <w:tcW w:type="dxa" w:w="2880"/>
+          </w:tcPr>
+          <w:p>
+            <w:r/>
+            <w:r>
+              <w:rPr>
+                <w:sz w:val="18"/>
+              </w:rPr>
+              <w:t>#1E4620</w:t>
+            </w:r>
+          </w:p>
+        </w:tc>
+        <w:tc>
+          <w:tcPr>
+            <w:tcW w:type="dxa" w:w="2880"/>
+          </w:tcPr>
+          <w:p>
+            <w:r/>
+            <w:r>
+              <w:rPr>
+                <w:sz w:val="18"/>
+              </w:rPr>
+              <w:t>Primary hover</w:t>
+            </w:r>
+          </w:p>
+        </w:tc>
+      </w:tr>
+      <w:tr>
+        <w:tc>
+          <w:tcPr>
+            <w:tcW w:type="dxa" w:w="2880"/>
+          </w:tcPr>
+          <w:p>
+            <w:r/>
+            <w:r>
+              <w:rPr>
+                <w:sz w:val="18"/>
+              </w:rPr>
+              <w:t>--forest-soft</w:t>
+            </w:r>
+          </w:p>
+        </w:tc>
+        <w:tc>
+          <w:tcPr>
+            <w:tcW w:type="dxa" w:w="2880"/>
+          </w:tcPr>
+          <w:p>
+            <w:r/>
+            <w:r>
+              <w:rPr>
+                <w:sz w:val="18"/>
+              </w:rPr>
+              <w:t>#2F5C34</w:t>
+            </w:r>
+          </w:p>
+        </w:tc>
+        <w:tc>
+          <w:tcPr>
+            <w:tcW w:type="dxa" w:w="2880"/>
+          </w:tcPr>
+          <w:p>
+            <w:r/>
+            <w:r>
+              <w:rPr>
+                <w:sz w:val="18"/>
+              </w:rPr>
+              <w:t>Focus outlines</w:t>
+            </w:r>
+          </w:p>
+        </w:tc>
+      </w:tr>
+      <w:tr>
+        <w:tc>
+          <w:tcPr>
+            <w:tcW w:type="dxa" w:w="2880"/>
+          </w:tcPr>
+          <w:p>
+            <w:r/>
+            <w:r>
+              <w:rPr>
+                <w:sz w:val="18"/>
+              </w:rPr>
+              <w:t>--gold</w:t>
+            </w:r>
+          </w:p>
+        </w:tc>
+        <w:tc>
+          <w:tcPr>
+            <w:tcW w:type="dxa" w:w="2880"/>
+          </w:tcPr>
+          <w:p>
+            <w:r/>
+            <w:r>
+              <w:rPr>
+                <w:sz w:val="18"/>
+              </w:rPr>
+              <w:t>#C7912E</w:t>
+            </w:r>
+          </w:p>
+        </w:tc>
+        <w:tc>
+          <w:tcPr>
+            <w:tcW w:type="dxa" w:w="2880"/>
+          </w:tcPr>
+          <w:p>
+            <w:r/>
+            <w:r>
+              <w:rPr>
+                <w:sz w:val="18"/>
+              </w:rPr>
+              <w:t>Accent, Buyer role, current step</w:t>
+            </w:r>
+          </w:p>
+        </w:tc>
+      </w:tr>
+      <w:tr>
+        <w:tc>
+          <w:tcPr>
+            <w:tcW w:type="dxa" w:w="2880"/>
+          </w:tcPr>
+          <w:p>
+            <w:r/>
+            <w:r>
+              <w:rPr>
+                <w:sz w:val="18"/>
+              </w:rPr>
+              <w:t>--gold-soft</w:t>
+            </w:r>
+          </w:p>
+        </w:tc>
+        <w:tc>
+          <w:tcPr>
+            <w:tcW w:type="dxa" w:w="2880"/>
+          </w:tcPr>
+          <w:p>
+            <w:r/>
+            <w:r>
+              <w:rPr>
+                <w:sz w:val="18"/>
+              </w:rPr>
+              <w:t>#E4C583</w:t>
+            </w:r>
+          </w:p>
+        </w:tc>
+        <w:tc>
+          <w:tcPr>
+            <w:tcW w:type="dxa" w:w="2880"/>
+          </w:tcPr>
+          <w:p>
+            <w:r/>
+            <w:r>
+              <w:rPr>
+                <w:sz w:val="18"/>
+              </w:rPr>
+              <w:t>Pills, text selection</w:t>
+            </w:r>
+          </w:p>
+        </w:tc>
+      </w:tr>
+      <w:tr>
+        <w:tc>
+          <w:tcPr>
+            <w:tcW w:type="dxa" w:w="2880"/>
+          </w:tcPr>
+          <w:p>
+            <w:r/>
+            <w:r>
+              <w:rPr>
+                <w:sz w:val="18"/>
+              </w:rPr>
+              <w:t>--clay</w:t>
+            </w:r>
+          </w:p>
+        </w:tc>
+        <w:tc>
+          <w:tcPr>
+            <w:tcW w:type="dxa" w:w="2880"/>
+          </w:tcPr>
+          <w:p>
+            <w:r/>
+            <w:r>
+              <w:rPr>
+                <w:sz w:val="18"/>
+              </w:rPr>
+              <w:t>#A65B31</w:t>
+            </w:r>
+          </w:p>
+        </w:tc>
+        <w:tc>
+          <w:tcPr>
+            <w:tcW w:type="dxa" w:w="2880"/>
+          </w:tcPr>
+          <w:p>
+            <w:r/>
+            <w:r>
+              <w:rPr>
+                <w:sz w:val="18"/>
+              </w:rPr>
+              <w:t>Vendor role, active category tabs</w:t>
+            </w:r>
+          </w:p>
+        </w:tc>
+      </w:tr>
+      <w:tr>
+        <w:tc>
+          <w:tcPr>
+            <w:tcW w:type="dxa" w:w="2880"/>
+          </w:tcPr>
+          <w:p>
+            <w:r/>
+            <w:r>
+              <w:rPr>
+                <w:sz w:val="18"/>
+              </w:rPr>
+              <w:t>--cream</w:t>
+            </w:r>
+          </w:p>
+        </w:tc>
+        <w:tc>
+          <w:tcPr>
+            <w:tcW w:type="dxa" w:w="2880"/>
+          </w:tcPr>
+          <w:p>
+            <w:r/>
+            <w:r>
+              <w:rPr>
+                <w:sz w:val="18"/>
+              </w:rPr>
+              <w:t>#F6F1E3</w:t>
+            </w:r>
+          </w:p>
+        </w:tc>
+        <w:tc>
+          <w:tcPr>
+            <w:tcW w:type="dxa" w:w="2880"/>
+          </w:tcPr>
+          <w:p>
+            <w:r/>
+            <w:r>
+              <w:rPr>
+                <w:sz w:val="18"/>
+              </w:rPr>
+              <w:t>Page and input background</w:t>
+            </w:r>
+          </w:p>
+        </w:tc>
+      </w:tr>
+      <w:tr>
+        <w:tc>
+          <w:tcPr>
+            <w:tcW w:type="dxa" w:w="2880"/>
+          </w:tcPr>
+          <w:p>
+            <w:r/>
+            <w:r>
+              <w:rPr>
+                <w:sz w:val="18"/>
+              </w:rPr>
+              <w:t>--paper</w:t>
+            </w:r>
+          </w:p>
+        </w:tc>
+        <w:tc>
+          <w:tcPr>
+            <w:tcW w:type="dxa" w:w="2880"/>
+          </w:tcPr>
+          <w:p>
+            <w:r/>
+            <w:r>
+              <w:rPr>
+                <w:sz w:val="18"/>
+              </w:rPr>
+              <w:t>#FFFEFA</w:t>
+            </w:r>
+          </w:p>
+        </w:tc>
+        <w:tc>
+          <w:tcPr>
+            <w:tcW w:type="dxa" w:w="2880"/>
+          </w:tcPr>
+          <w:p>
+            <w:r/>
+            <w:r>
+              <w:rPr>
+                <w:sz w:val="18"/>
+              </w:rPr>
+              <w:t>Cards, panels</w:t>
+            </w:r>
+          </w:p>
+        </w:tc>
+      </w:tr>
+      <w:tr>
+        <w:tc>
+          <w:tcPr>
+            <w:tcW w:type="dxa" w:w="2880"/>
+          </w:tcPr>
+          <w:p>
+            <w:r/>
+            <w:r>
+              <w:rPr>
+                <w:sz w:val="18"/>
+              </w:rPr>
+              <w:t>--ink / --ink-soft</w:t>
+            </w:r>
+          </w:p>
+        </w:tc>
+        <w:tc>
+          <w:tcPr>
+            <w:tcW w:type="dxa" w:w="2880"/>
+          </w:tcPr>
+          <w:p>
+            <w:r/>
+            <w:r>
+              <w:rPr>
+                <w:sz w:val="18"/>
+              </w:rPr>
+              <w:t>#22261D / #5B5F51</w:t>
+            </w:r>
+          </w:p>
+        </w:tc>
+        <w:tc>
+          <w:tcPr>
+            <w:tcW w:type="dxa" w:w="2880"/>
+          </w:tcPr>
+          <w:p>
+            <w:r/>
+            <w:r>
+              <w:rPr>
+                <w:sz w:val="18"/>
+              </w:rPr>
+              <w:t>Body / secondary text</w:t>
+            </w:r>
+          </w:p>
+        </w:tc>
+      </w:tr>
+      <w:tr>
+        <w:tc>
+          <w:tcPr>
+            <w:tcW w:type="dxa" w:w="2880"/>
+          </w:tcPr>
+          <w:p>
+            <w:r/>
+            <w:r>
+              <w:rPr>
+                <w:sz w:val="18"/>
+              </w:rPr>
+              <w:t>--line / --line-soft</w:t>
+            </w:r>
+          </w:p>
+        </w:tc>
+        <w:tc>
+          <w:tcPr>
+            <w:tcW w:type="dxa" w:w="2880"/>
+          </w:tcPr>
+          <w:p>
+            <w:r/>
+            <w:r>
+              <w:rPr>
+                <w:sz w:val="18"/>
+              </w:rPr>
+              <w:t>#DEDBC6 / #EAE7D8</w:t>
+            </w:r>
+          </w:p>
+        </w:tc>
+        <w:tc>
+          <w:tcPr>
+            <w:tcW w:type="dxa" w:w="2880"/>
+          </w:tcPr>
+          <w:p>
+            <w:r/>
+            <w:r>
+              <w:rPr>
+                <w:sz w:val="18"/>
+              </w:rPr>
+              <w:t>Borders, dividers</w:t>
+            </w:r>
+          </w:p>
+        </w:tc>
+      </w:tr>
+      <w:tr>
+        <w:tc>
+          <w:tcPr>
+            <w:tcW w:type="dxa" w:w="2880"/>
+          </w:tcPr>
+          <w:p>
+            <w:r/>
+            <w:r>
+              <w:rPr>
+                <w:sz w:val="18"/>
+              </w:rPr>
+              <w:t>--good / --good-bg</w:t>
+            </w:r>
+          </w:p>
+        </w:tc>
+        <w:tc>
+          <w:tcPr>
+            <w:tcW w:type="dxa" w:w="2880"/>
+          </w:tcPr>
+          <w:p>
+            <w:r/>
+            <w:r>
+              <w:rPr>
+                <w:sz w:val="18"/>
+              </w:rPr>
+              <w:t>#2F6B3A / #E7F0E3</w:t>
+            </w:r>
+          </w:p>
+        </w:tc>
+        <w:tc>
+          <w:tcPr>
+            <w:tcW w:type="dxa" w:w="2880"/>
+          </w:tcPr>
+          <w:p>
+            <w:r/>
+            <w:r>
+              <w:rPr>
+                <w:sz w:val="18"/>
+              </w:rPr>
+              <w:t>Success, Accepted, Delivered</w:t>
+            </w:r>
+          </w:p>
+        </w:tc>
+      </w:tr>
+      <w:tr>
+        <w:tc>
+          <w:tcPr>
+            <w:tcW w:type="dxa" w:w="2880"/>
+          </w:tcPr>
+          <w:p>
+            <w:r/>
+            <w:r>
+              <w:rPr>
+                <w:sz w:val="18"/>
+              </w:rPr>
+              <w:t>--warn / --warn-bg</w:t>
+            </w:r>
+          </w:p>
+        </w:tc>
+        <w:tc>
+          <w:tcPr>
+            <w:tcW w:type="dxa" w:w="2880"/>
+          </w:tcPr>
+          <w:p>
+            <w:r/>
+            <w:r>
+              <w:rPr>
+                <w:sz w:val="18"/>
+              </w:rPr>
+              <w:t>#9A6A18 / #F7ECD6</w:t>
+            </w:r>
+          </w:p>
+        </w:tc>
+        <w:tc>
+          <w:tcPr>
+            <w:tcW w:type="dxa" w:w="2880"/>
+          </w:tcPr>
+          <w:p>
+            <w:r/>
+            <w:r>
+              <w:rPr>
+                <w:sz w:val="18"/>
+              </w:rPr>
+              <w:t>Open</w:t>
+            </w:r>
+          </w:p>
+        </w:tc>
+      </w:tr>
+      <w:tr>
+        <w:tc>
+          <w:tcPr>
+            <w:tcW w:type="dxa" w:w="2880"/>
+          </w:tcPr>
+          <w:p>
+            <w:r/>
+            <w:r>
+              <w:rPr>
+                <w:sz w:val="18"/>
+              </w:rPr>
+              <w:t>--info / --info-bg</w:t>
+            </w:r>
+          </w:p>
+        </w:tc>
+        <w:tc>
+          <w:tcPr>
+            <w:tcW w:type="dxa" w:w="2880"/>
+          </w:tcPr>
+          <w:p>
+            <w:r/>
+            <w:r>
+              <w:rPr>
+                <w:sz w:val="18"/>
+              </w:rPr>
+              <w:t>#3D5F8A / #E4EBF4</w:t>
+            </w:r>
+          </w:p>
+        </w:tc>
+        <w:tc>
+          <w:tcPr>
+            <w:tcW w:type="dxa" w:w="2880"/>
+          </w:tcPr>
+          <w:p>
+            <w:r/>
+            <w:r>
+              <w:rPr>
+                <w:sz w:val="18"/>
+              </w:rPr>
+              <w:t>In progress: Aggregating, Matching farmers</w:t>
+            </w:r>
+          </w:p>
+        </w:tc>
+      </w:tr>
+    </w:tbl>
+    <w:p>
+      <w:r>
+        <w:t>Dark mode is kept (decision D7 in docs/ceo-demo-gap-report.md). Dark values are derived from the light ones and applied via prefers-color-scheme or data-theme on the html element.</w:t>
+      </w:r>
+    </w:p>
+    <w:p>
+      <w:pPr>
+        <w:pStyle w:val="Heading2"/>
+      </w:pPr>
+      <w:r>
+        <w:t>10.2 Typography</w:t>
+      </w:r>
+    </w:p>
+    <w:p>
+      <w:r>
+        <w:t>Headings: Fraunces 600 with slight negative letter-spacing (fallback Georgia). Body and UI: Archivo 400-800 (fallback Segoe UI). Both are loaded from Google Fonts in tokens.css. This replaces the single-family Manrope decision in Section 4. (Manrope was declared but never actually loaded, so pages rendered in the system font.)</w:t>
+      </w:r>
+    </w:p>
+    <w:p>
+      <w:pPr>
+        <w:pStyle w:val="Heading2"/>
+      </w:pPr>
+      <w:r>
+        <w:t>10.3 Shape, elevation and role colours</w:t>
+      </w:r>
+    </w:p>
+    <w:p>
+      <w:r>
+        <w:t>Card radius 14px, chip radius 999px, button radius 9px (7px small), and soft forest-tinted shadows (--shadow-1 resting, --shadow-2 raised). Role colour-coding is used everywhere: Farmer = forest, Buyer = gold, Vendor = clay, on the portal role chip, the portal card top border and active states.</w:t>
+      </w:r>
+    </w:p>
+    <w:p>
+      <w:pPr>
+        <w:pStyle w:val="Heading2"/>
+      </w:pPr>
+      <w:r>
+        <w:t>10.4 Shared components</w:t>
+      </w:r>
+    </w:p>
+    <w:p>
+      <w:r>
+        <w:t>Implemented once in frontend/assets/components.css and components.js (window.FM) rather than per page: top bar with portal switcher, buttons (primary/ghost/gold/small/disabled), card + hint, badges, horizontal stepper, progress bar, form field + two-column row, data table with expandable detail row, category pill tabs, product card, sticky cart panel, toast, multi-step modal, live activity ticker, sign-in card, and a stroke SVG icon set that replaces the demo's emoji. prefers-reduced-motion disables all animation.</w:t>
+      </w:r>
+    </w:p>
     <w:sectPr>
       <w:pgSz w:w="12240" w:h="15840"/>
       <w:pgMar w:top="1440" w:right="1800" w:bottom="1440" w:left="1800" w:header="720" w:footer="720" w:gutter="0"/>

</xml_diff>